<commit_message>
fix(pages): walkthrough and samples work when opened from disk
index.html fetched walkthrough.json and the sample files, which browsers
block on file:// pages, so the walkthrough never started and the CSV/JSON/
Markdown tabs showed only a link. The capture script now writes
docs/site-data.js (frames plus sample text) and the page loads it with a
plain script tag, which works on file:// and GitHub Pages alike.

Co-Authored-By: Claude Opus 5.5 <noreply@anthropic.com>
</commit_message>
<xml_diff>
--- a/docs/samples/sign-in-smoke-test.docx
+++ b/docs/samples/sign-in-smoke-test.docx
@@ -31,7 +31,7 @@
         <w:t xml:space="preserve">Start Time: </w:t>
       </w:r>
       <w:r>
-        <w:t xml:space="preserve">24/10/2026, 1:33 am</w:t>
+        <w:t xml:space="preserve">24/10/2026, 1:44 am</w:t>
       </w:r>
     </w:p>
     <w:p>
@@ -43,7 +43,7 @@
         <w:t xml:space="preserve">End Time: </w:t>
       </w:r>
       <w:r>
-        <w:t xml:space="preserve">24/10/2026, 1:33 am</w:t>
+        <w:t xml:space="preserve">24/10/2026, 1:44 am</w:t>
       </w:r>
     </w:p>
     <w:p>

</xml_diff>

<commit_message>
docs(pages): screenshot step in walkthrough, LinkedIn, Word/PDF default
- Capture clicks the in-page toolbar's screenshot button on the dashboard,
  adding a "Take a screenshot any time" frame; the samples now include the
  screenshot step and the popup shows 1 screenshot.
- Developer card: "Meet the developer", role line, LinkedIn button.
- The Developers audience opens on the Word/PDF sample like the others.

Co-Authored-By: Claude Opus 5.5 <noreply@anthropic.com>
</commit_message>
<xml_diff>
--- a/docs/samples/sign-in-smoke-test.docx
+++ b/docs/samples/sign-in-smoke-test.docx
@@ -31,7 +31,7 @@
         <w:t xml:space="preserve">Start Time: </w:t>
       </w:r>
       <w:r>
-        <w:t xml:space="preserve">24/10/2026, 1:44 am</w:t>
+        <w:t xml:space="preserve">24/10/2026, 1:50 am</w:t>
       </w:r>
     </w:p>
     <w:p>
@@ -43,7 +43,7 @@
         <w:t xml:space="preserve">End Time: </w:t>
       </w:r>
       <w:r>
-        <w:t xml:space="preserve">24/10/2026, 1:44 am</w:t>
+        <w:t xml:space="preserve">24/10/2026, 1:50 am</w:t>
       </w:r>
     </w:p>
     <w:p>
@@ -55,7 +55,7 @@
         <w:t xml:space="preserve">Total Steps: </w:t>
       </w:r>
       <w:r>
-        <w:t xml:space="preserve">5</w:t>
+        <w:t xml:space="preserve">6</w:t>
       </w:r>
     </w:p>
     <w:p>
@@ -104,6 +104,59 @@
       </w:pPr>
       <w:r>
         <w:t xml:space="preserve">5. NAVIGATE on "Page Navigation" to https://staging.example.com/dashboard</w:t>
+      </w:r>
+    </w:p>
+    <w:p>
+      <w:pPr>
+        <w:spacing w:before="120"/>
+      </w:pPr>
+      <w:r>
+        <w:t xml:space="preserve">6. Manual screenshot</w:t>
+      </w:r>
+    </w:p>
+    <w:p>
+      <w:pPr>
+        <w:spacing w:after="200"/>
+      </w:pPr>
+      <w:r>
+        <w:drawing>
+          <wp:inline distT="0" distB="0" distL="0" distR="0">
+            <wp:extent cx="3390900" cy="4276725"/>
+            <wp:effectExtent b="0" l="0" r="0" t="0"/>
+            <wp:docPr id="1" name="" descr="" title=""/>
+            <wp:cNvGraphicFramePr>
+              <a:graphicFrameLocks xmlns:a="http://schemas.openxmlformats.org/drawingml/2006/main" noChangeAspect="1"/>
+            </wp:cNvGraphicFramePr>
+            <a:graphic xmlns:a="http://schemas.openxmlformats.org/drawingml/2006/main">
+              <a:graphicData uri="http://schemas.openxmlformats.org/drawingml/2006/picture">
+                <pic:pic xmlns:pic="http://schemas.openxmlformats.org/drawingml/2006/picture">
+                  <pic:nvPicPr>
+                    <pic:cNvPr id="0" name="" descr=""/>
+                    <pic:cNvPicPr>
+                      <a:picLocks noChangeAspect="1" noChangeArrowheads="1"/>
+                    </pic:cNvPicPr>
+                  </pic:nvPicPr>
+                  <pic:blipFill>
+                    <a:blip r:embed="rId6" cstate="none"/>
+                    <a:srcRect/>
+                    <a:stretch>
+                      <a:fillRect/>
+                    </a:stretch>
+                  </pic:blipFill>
+                  <pic:spPr bwMode="auto">
+                    <a:xfrm>
+                      <a:off x="0" y="0"/>
+                      <a:ext cx="3390900" cy="4276725"/>
+                    </a:xfrm>
+                    <a:prstGeom prst="rect">
+                      <a:avLst/>
+                    </a:prstGeom>
+                  </pic:spPr>
+                </pic:pic>
+              </a:graphicData>
+            </a:graphic>
+          </wp:inline>
+        </w:drawing>
       </w:r>
     </w:p>
     <w:sectPr>
@@ -159,7 +212,7 @@
 
 <file path=word/numbering.xml><?xml version="1.0" encoding="utf-8"?>
 <w:numbering xmlns:wpc="http://schemas.microsoft.com/office/word/2010/wordprocessingCanvas" xmlns:mc="http://schemas.openxmlformats.org/markup-compatibility/2006" xmlns:o="urn:schemas-microsoft-com:office:office" xmlns:r="http://schemas.openxmlformats.org/officeDocument/2006/relationships" xmlns:m="http://schemas.openxmlformats.org/officeDocument/2006/math" xmlns:v="urn:schemas-microsoft-com:vml" xmlns:wp14="http://schemas.microsoft.com/office/word/2010/wordprocessingDrawing" xmlns:wp="http://schemas.openxmlformats.org/drawingml/2006/wordprocessingDrawing" xmlns:w10="urn:schemas-microsoft-com:office:word" xmlns:w="http://schemas.openxmlformats.org/wordprocessingml/2006/main" xmlns:w14="http://schemas.microsoft.com/office/word/2010/wordml" xmlns:w15="http://schemas.microsoft.com/office/word/2012/wordml" xmlns:wpg="http://schemas.microsoft.com/office/word/2010/wordprocessingGroup" xmlns:wpi="http://schemas.microsoft.com/office/word/2010/wordprocessingInk" xmlns:wne="http://schemas.microsoft.com/office/word/2006/wordml" xmlns:wps="http://schemas.microsoft.com/office/word/2010/wordprocessingShape" mc:Ignorable="w14 w15 wp14">
-  <w:abstractNum w:abstractNumId="1" w15:restartNumberingAfterBreak="0">
+  <w:abstractNum w:abstractNumId="2" w15:restartNumberingAfterBreak="0">
     <w:multiLevelType w:val="hybridMultilevel"/>
     <w:lvl w:ilvl="0" w15:tentative="1">
       <w:start w:val="1"/>
@@ -244,7 +297,7 @@
     </w:lvl>
   </w:abstractNum>
   <w:num w:numId="1">
-    <w:abstractNumId w:val="1"/>
+    <w:abstractNumId w:val="2"/>
     <w:lvlOverride w:ilvl="0">
       <w:startOverride w:val="1"/>
     </w:lvlOverride>

</xml_diff>

<commit_message>
docs(pages): walkthrough scrolls the review page to the screenshot step
Adds a frame after the top of the review page that scrolls down to the
later steps, ending on the manual screenshot step with its thumbnail.

Co-Authored-By: Claude Opus 5.5 <noreply@anthropic.com>
</commit_message>
<xml_diff>
--- a/docs/samples/sign-in-smoke-test.docx
+++ b/docs/samples/sign-in-smoke-test.docx
@@ -31,7 +31,7 @@
         <w:t xml:space="preserve">Start Time: </w:t>
       </w:r>
       <w:r>
-        <w:t xml:space="preserve">24/10/2026, 1:50 am</w:t>
+        <w:t xml:space="preserve">24/10/2026, 1:55 am</w:t>
       </w:r>
     </w:p>
     <w:p>
@@ -43,7 +43,7 @@
         <w:t xml:space="preserve">End Time: </w:t>
       </w:r>
       <w:r>
-        <w:t xml:space="preserve">24/10/2026, 1:50 am</w:t>
+        <w:t xml:space="preserve">24/10/2026, 1:55 am</w:t>
       </w:r>
     </w:p>
     <w:p>
@@ -121,7 +121,7 @@
       <w:r>
         <w:drawing>
           <wp:inline distT="0" distB="0" distL="0" distR="0">
-            <wp:extent cx="3390900" cy="4276725"/>
+            <wp:extent cx="3486150" cy="4276725"/>
             <wp:effectExtent b="0" l="0" r="0" t="0"/>
             <wp:docPr id="1" name="" descr="" title=""/>
             <wp:cNvGraphicFramePr>
@@ -146,7 +146,7 @@
                   <pic:spPr bwMode="auto">
                     <a:xfrm>
                       <a:off x="0" y="0"/>
-                      <a:ext cx="3390900" cy="4276725"/>
+                      <a:ext cx="3486150" cy="4276725"/>
                     </a:xfrm>
                     <a:prstGeom prst="rect">
                       <a:avLst/>

</xml_diff>

<commit_message>
docs(pages): re-capture walkthrough and samples with the naming fix
Co-Authored-By: Claude Opus 5.5 <noreply@anthropic.com>
</commit_message>
<xml_diff>
--- a/docs/samples/sign-in-smoke-test.docx
+++ b/docs/samples/sign-in-smoke-test.docx
@@ -31,7 +31,7 @@
         <w:t xml:space="preserve">Start Time: </w:t>
       </w:r>
       <w:r>
-        <w:t xml:space="preserve">24/10/2026, 1:55 am</w:t>
+        <w:t xml:space="preserve">24/10/2026, 9:31 pm</w:t>
       </w:r>
     </w:p>
     <w:p>
@@ -43,7 +43,7 @@
         <w:t xml:space="preserve">End Time: </w:t>
       </w:r>
       <w:r>
-        <w:t xml:space="preserve">24/10/2026, 1:55 am</w:t>
+        <w:t xml:space="preserve">24/10/2026, 9:31 pm</w:t>
       </w:r>
     </w:p>
     <w:p>
@@ -55,7 +55,7 @@
         <w:t xml:space="preserve">Total Steps: </w:t>
       </w:r>
       <w:r>
-        <w:t xml:space="preserve">6</w:t>
+        <w:t xml:space="preserve">5</w:t>
       </w:r>
     </w:p>
     <w:p>
@@ -87,15 +87,15 @@
         <w:spacing w:before="120"/>
       </w:pPr>
       <w:r>
-        <w:t xml:space="preserve">3. CLICK on "Password"</w:t>
-      </w:r>
-    </w:p>
-    <w:p>
-      <w:pPr>
-        <w:spacing w:before="120"/>
-      </w:pPr>
-      <w:r>
-        <w:t xml:space="preserve">4. SUBMIT on "Username Password Sign In"</w:t>
+        <w:t xml:space="preserve">3. CLICK on "Sign In"</w:t>
+      </w:r>
+    </w:p>
+    <w:p>
+      <w:pPr>
+        <w:spacing w:before="120"/>
+      </w:pPr>
+      <w:r>
+        <w:t xml:space="preserve">4. SUBMIT on "Sign In"</w:t>
       </w:r>
     </w:p>
     <w:p>
@@ -104,59 +104,6 @@
       </w:pPr>
       <w:r>
         <w:t xml:space="preserve">5. NAVIGATE on "Page Navigation" to https://staging.example.com/dashboard</w:t>
-      </w:r>
-    </w:p>
-    <w:p>
-      <w:pPr>
-        <w:spacing w:before="120"/>
-      </w:pPr>
-      <w:r>
-        <w:t xml:space="preserve">6. Manual screenshot</w:t>
-      </w:r>
-    </w:p>
-    <w:p>
-      <w:pPr>
-        <w:spacing w:after="200"/>
-      </w:pPr>
-      <w:r>
-        <w:drawing>
-          <wp:inline distT="0" distB="0" distL="0" distR="0">
-            <wp:extent cx="3486150" cy="4276725"/>
-            <wp:effectExtent b="0" l="0" r="0" t="0"/>
-            <wp:docPr id="1" name="" descr="" title=""/>
-            <wp:cNvGraphicFramePr>
-              <a:graphicFrameLocks xmlns:a="http://schemas.openxmlformats.org/drawingml/2006/main" noChangeAspect="1"/>
-            </wp:cNvGraphicFramePr>
-            <a:graphic xmlns:a="http://schemas.openxmlformats.org/drawingml/2006/main">
-              <a:graphicData uri="http://schemas.openxmlformats.org/drawingml/2006/picture">
-                <pic:pic xmlns:pic="http://schemas.openxmlformats.org/drawingml/2006/picture">
-                  <pic:nvPicPr>
-                    <pic:cNvPr id="0" name="" descr=""/>
-                    <pic:cNvPicPr>
-                      <a:picLocks noChangeAspect="1" noChangeArrowheads="1"/>
-                    </pic:cNvPicPr>
-                  </pic:nvPicPr>
-                  <pic:blipFill>
-                    <a:blip r:embed="rId6" cstate="none"/>
-                    <a:srcRect/>
-                    <a:stretch>
-                      <a:fillRect/>
-                    </a:stretch>
-                  </pic:blipFill>
-                  <pic:spPr bwMode="auto">
-                    <a:xfrm>
-                      <a:off x="0" y="0"/>
-                      <a:ext cx="3486150" cy="4276725"/>
-                    </a:xfrm>
-                    <a:prstGeom prst="rect">
-                      <a:avLst/>
-                    </a:prstGeom>
-                  </pic:spPr>
-                </pic:pic>
-              </a:graphicData>
-            </a:graphic>
-          </wp:inline>
-        </w:drawing>
       </w:r>
     </w:p>
     <w:sectPr>
@@ -212,7 +159,7 @@
 
 <file path=word/numbering.xml><?xml version="1.0" encoding="utf-8"?>
 <w:numbering xmlns:wpc="http://schemas.microsoft.com/office/word/2010/wordprocessingCanvas" xmlns:mc="http://schemas.openxmlformats.org/markup-compatibility/2006" xmlns:o="urn:schemas-microsoft-com:office:office" xmlns:r="http://schemas.openxmlformats.org/officeDocument/2006/relationships" xmlns:m="http://schemas.openxmlformats.org/officeDocument/2006/math" xmlns:v="urn:schemas-microsoft-com:vml" xmlns:wp14="http://schemas.microsoft.com/office/word/2010/wordprocessingDrawing" xmlns:wp="http://schemas.openxmlformats.org/drawingml/2006/wordprocessingDrawing" xmlns:w10="urn:schemas-microsoft-com:office:word" xmlns:w="http://schemas.openxmlformats.org/wordprocessingml/2006/main" xmlns:w14="http://schemas.microsoft.com/office/word/2010/wordml" xmlns:w15="http://schemas.microsoft.com/office/word/2012/wordml" xmlns:wpg="http://schemas.microsoft.com/office/word/2010/wordprocessingGroup" xmlns:wpi="http://schemas.microsoft.com/office/word/2010/wordprocessingInk" xmlns:wne="http://schemas.microsoft.com/office/word/2006/wordml" xmlns:wps="http://schemas.microsoft.com/office/word/2010/wordprocessingShape" mc:Ignorable="w14 w15 wp14">
-  <w:abstractNum w:abstractNumId="2" w15:restartNumberingAfterBreak="0">
+  <w:abstractNum w:abstractNumId="1" w15:restartNumberingAfterBreak="0">
     <w:multiLevelType w:val="hybridMultilevel"/>
     <w:lvl w:ilvl="0" w15:tentative="1">
       <w:start w:val="1"/>
@@ -297,7 +244,7 @@
     </w:lvl>
   </w:abstractNum>
   <w:num w:numId="1">
-    <w:abstractNumId w:val="2"/>
+    <w:abstractNumId w:val="1"/>
     <w:lvlOverride w:ilvl="0">
       <w:startOverride w:val="1"/>
     </w:lvlOverride>

</xml_diff>